<commit_message>
Update Mechanical Enginering Poject Report.docx
</commit_message>
<xml_diff>
--- a/docs/Mechanical Enginering Poject Report.docx
+++ b/docs/Mechanical Enginering Poject Report.docx
@@ -440,728 +440,22 @@
     <w:p/>
     <w:p/>
     <w:p/>
-    <w:sdt>
-      <w:sdtPr>
-        <w:rPr>
-          <w:rFonts w:asciiTheme="minorHAnsi" w:eastAsiaTheme="minorHAnsi" w:hAnsiTheme="minorHAnsi" w:cstheme="minorBidi"/>
-          <w:color w:val="auto"/>
-          <w:kern w:val="2"/>
-          <w:sz w:val="24"/>
-          <w:szCs w:val="24"/>
-          <w14:ligatures w14:val="standardContextual"/>
-        </w:rPr>
-        <w:id w:val="-735400445"/>
-        <w:docPartObj>
-          <w:docPartGallery w:val="Table of Contents"/>
-          <w:docPartUnique/>
-        </w:docPartObj>
-      </w:sdtPr>
-      <w:sdtEndPr>
+    <w:p>
+      <w:pPr>
         <w:rPr>
           <w:b/>
           <w:bCs/>
-          <w:noProof/>
-          <w:sz w:val="28"/>
-          <w:szCs w:val="28"/>
-        </w:rPr>
-      </w:sdtEndPr>
-      <w:sdtContent>
-        <w:p>
-          <w:pPr>
-            <w:pStyle w:val="TOCHeading"/>
-            <w:jc w:val="center"/>
-            <w:rPr>
-              <w:sz w:val="44"/>
-              <w:szCs w:val="44"/>
-            </w:rPr>
-          </w:pPr>
-          <w:r>
-            <w:rPr>
-              <w:sz w:val="44"/>
-              <w:szCs w:val="44"/>
-            </w:rPr>
-            <w:t>Table Of Contents</w:t>
-          </w:r>
-        </w:p>
-        <w:p>
-          <w:pPr>
-            <w:pStyle w:val="TOC1"/>
-            <w:tabs>
-              <w:tab w:val="right" w:leader="dot" w:pos="9350"/>
-            </w:tabs>
-            <w:jc w:val="center"/>
-            <w:rPr>
-              <w:rFonts w:eastAsiaTheme="minorEastAsia"/>
-              <w:noProof/>
-              <w:sz w:val="28"/>
-              <w:szCs w:val="28"/>
-            </w:rPr>
-          </w:pPr>
-          <w:r>
-            <w:rPr>
-              <w:sz w:val="28"/>
-              <w:szCs w:val="28"/>
-            </w:rPr>
-            <w:fldChar w:fldCharType="begin"/>
-          </w:r>
-          <w:r>
-            <w:rPr>
-              <w:sz w:val="28"/>
-              <w:szCs w:val="28"/>
-            </w:rPr>
-            <w:instrText xml:space="preserve"> TOC \o "1-3" \h \z \u </w:instrText>
-          </w:r>
-          <w:r>
-            <w:rPr>
-              <w:sz w:val="28"/>
-              <w:szCs w:val="28"/>
-            </w:rPr>
-            <w:fldChar w:fldCharType="separate"/>
-          </w:r>
-          <w:hyperlink w:anchor="_Toc228121648" w:history="1">
-            <w:r>
-              <w:rPr>
-                <w:rStyle w:val="Hyperlink"/>
-                <w:noProof/>
-                <w:sz w:val="28"/>
-                <w:szCs w:val="28"/>
-              </w:rPr>
-              <w:t>1. Data Source</w:t>
-            </w:r>
-            <w:r>
-              <w:rPr>
-                <w:noProof/>
-                <w:webHidden/>
-                <w:sz w:val="28"/>
-                <w:szCs w:val="28"/>
-              </w:rPr>
-              <w:tab/>
-            </w:r>
-            <w:r>
-              <w:rPr>
-                <w:noProof/>
-                <w:webHidden/>
-                <w:sz w:val="28"/>
-                <w:szCs w:val="28"/>
-              </w:rPr>
-              <w:fldChar w:fldCharType="begin"/>
-            </w:r>
-            <w:r>
-              <w:rPr>
-                <w:noProof/>
-                <w:webHidden/>
-                <w:sz w:val="28"/>
-                <w:szCs w:val="28"/>
-              </w:rPr>
-              <w:instrText xml:space="preserve"> PAGEREF _Toc228121648 \h </w:instrText>
-            </w:r>
-            <w:r>
-              <w:rPr>
-                <w:noProof/>
-                <w:webHidden/>
-                <w:sz w:val="28"/>
-                <w:szCs w:val="28"/>
-              </w:rPr>
-            </w:r>
-            <w:r>
-              <w:rPr>
-                <w:noProof/>
-                <w:webHidden/>
-                <w:sz w:val="28"/>
-                <w:szCs w:val="28"/>
-              </w:rPr>
-              <w:fldChar w:fldCharType="separate"/>
-            </w:r>
-            <w:r>
-              <w:rPr>
-                <w:noProof/>
-                <w:webHidden/>
-                <w:sz w:val="28"/>
-                <w:szCs w:val="28"/>
-              </w:rPr>
-              <w:t>3</w:t>
-            </w:r>
-            <w:r>
-              <w:rPr>
-                <w:noProof/>
-                <w:webHidden/>
-                <w:sz w:val="28"/>
-                <w:szCs w:val="28"/>
-              </w:rPr>
-              <w:fldChar w:fldCharType="end"/>
-            </w:r>
-          </w:hyperlink>
-        </w:p>
-        <w:p>
-          <w:pPr>
-            <w:pStyle w:val="TOC1"/>
-            <w:tabs>
-              <w:tab w:val="right" w:leader="dot" w:pos="9350"/>
-            </w:tabs>
-            <w:jc w:val="center"/>
-            <w:rPr>
-              <w:rFonts w:eastAsiaTheme="minorEastAsia"/>
-              <w:noProof/>
-              <w:sz w:val="28"/>
-              <w:szCs w:val="28"/>
-            </w:rPr>
-          </w:pPr>
-          <w:hyperlink w:anchor="_Toc228121649" w:history="1">
-            <w:r>
-              <w:rPr>
-                <w:rStyle w:val="Hyperlink"/>
-                <w:noProof/>
-                <w:sz w:val="28"/>
-                <w:szCs w:val="28"/>
-              </w:rPr>
-              <w:t>2. Approach</w:t>
-            </w:r>
-            <w:r>
-              <w:rPr>
-                <w:noProof/>
-                <w:webHidden/>
-                <w:sz w:val="28"/>
-                <w:szCs w:val="28"/>
-              </w:rPr>
-              <w:tab/>
-            </w:r>
-            <w:r>
-              <w:rPr>
-                <w:noProof/>
-                <w:webHidden/>
-                <w:sz w:val="28"/>
-                <w:szCs w:val="28"/>
-              </w:rPr>
-              <w:fldChar w:fldCharType="begin"/>
-            </w:r>
-            <w:r>
-              <w:rPr>
-                <w:noProof/>
-                <w:webHidden/>
-                <w:sz w:val="28"/>
-                <w:szCs w:val="28"/>
-              </w:rPr>
-              <w:instrText xml:space="preserve"> PAGEREF _Toc228121649 \h </w:instrText>
-            </w:r>
-            <w:r>
-              <w:rPr>
-                <w:noProof/>
-                <w:webHidden/>
-                <w:sz w:val="28"/>
-                <w:szCs w:val="28"/>
-              </w:rPr>
-            </w:r>
-            <w:r>
-              <w:rPr>
-                <w:noProof/>
-                <w:webHidden/>
-                <w:sz w:val="28"/>
-                <w:szCs w:val="28"/>
-              </w:rPr>
-              <w:fldChar w:fldCharType="separate"/>
-            </w:r>
-            <w:r>
-              <w:rPr>
-                <w:noProof/>
-                <w:webHidden/>
-                <w:sz w:val="28"/>
-                <w:szCs w:val="28"/>
-              </w:rPr>
-              <w:t>3</w:t>
-            </w:r>
-            <w:r>
-              <w:rPr>
-                <w:noProof/>
-                <w:webHidden/>
-                <w:sz w:val="28"/>
-                <w:szCs w:val="28"/>
-              </w:rPr>
-              <w:fldChar w:fldCharType="end"/>
-            </w:r>
-          </w:hyperlink>
-        </w:p>
-        <w:p>
-          <w:pPr>
-            <w:pStyle w:val="TOC1"/>
-            <w:tabs>
-              <w:tab w:val="right" w:leader="dot" w:pos="9350"/>
-            </w:tabs>
-            <w:jc w:val="center"/>
-            <w:rPr>
-              <w:rFonts w:eastAsiaTheme="minorEastAsia"/>
-              <w:noProof/>
-              <w:sz w:val="28"/>
-              <w:szCs w:val="28"/>
-            </w:rPr>
-          </w:pPr>
-          <w:hyperlink w:anchor="_Toc228121650" w:history="1">
-            <w:r>
-              <w:rPr>
-                <w:rStyle w:val="Hyperlink"/>
-                <w:noProof/>
-                <w:sz w:val="28"/>
-                <w:szCs w:val="28"/>
-              </w:rPr>
-              <w:t>3. Summary of Methods Used</w:t>
-            </w:r>
-            <w:r>
-              <w:rPr>
-                <w:noProof/>
-                <w:webHidden/>
-                <w:sz w:val="28"/>
-                <w:szCs w:val="28"/>
-              </w:rPr>
-              <w:tab/>
-            </w:r>
-            <w:r>
-              <w:rPr>
-                <w:noProof/>
-                <w:webHidden/>
-                <w:sz w:val="28"/>
-                <w:szCs w:val="28"/>
-              </w:rPr>
-              <w:fldChar w:fldCharType="begin"/>
-            </w:r>
-            <w:r>
-              <w:rPr>
-                <w:noProof/>
-                <w:webHidden/>
-                <w:sz w:val="28"/>
-                <w:szCs w:val="28"/>
-              </w:rPr>
-              <w:instrText xml:space="preserve"> PAGEREF _Toc228121650 \h </w:instrText>
-            </w:r>
-            <w:r>
-              <w:rPr>
-                <w:noProof/>
-                <w:webHidden/>
-                <w:sz w:val="28"/>
-                <w:szCs w:val="28"/>
-              </w:rPr>
-            </w:r>
-            <w:r>
-              <w:rPr>
-                <w:noProof/>
-                <w:webHidden/>
-                <w:sz w:val="28"/>
-                <w:szCs w:val="28"/>
-              </w:rPr>
-              <w:fldChar w:fldCharType="separate"/>
-            </w:r>
-            <w:r>
-              <w:rPr>
-                <w:noProof/>
-                <w:webHidden/>
-                <w:sz w:val="28"/>
-                <w:szCs w:val="28"/>
-              </w:rPr>
-              <w:t>3</w:t>
-            </w:r>
-            <w:r>
-              <w:rPr>
-                <w:noProof/>
-                <w:webHidden/>
-                <w:sz w:val="28"/>
-                <w:szCs w:val="28"/>
-              </w:rPr>
-              <w:fldChar w:fldCharType="end"/>
-            </w:r>
-          </w:hyperlink>
-        </w:p>
-        <w:p>
-          <w:pPr>
-            <w:pStyle w:val="TOC2"/>
-            <w:tabs>
-              <w:tab w:val="right" w:leader="dot" w:pos="9350"/>
-            </w:tabs>
-            <w:jc w:val="center"/>
-            <w:rPr>
-              <w:noProof/>
-              <w:sz w:val="28"/>
-              <w:szCs w:val="28"/>
-            </w:rPr>
-          </w:pPr>
-          <w:hyperlink w:anchor="_Toc228121651" w:history="1">
-            <w:r>
-              <w:rPr>
-                <w:rStyle w:val="Hyperlink"/>
-                <w:noProof/>
-                <w:sz w:val="28"/>
-                <w:szCs w:val="28"/>
-              </w:rPr>
-              <w:t>First Pipeline</w:t>
-            </w:r>
-            <w:r>
-              <w:rPr>
-                <w:noProof/>
-                <w:webHidden/>
-                <w:sz w:val="28"/>
-                <w:szCs w:val="28"/>
-              </w:rPr>
-              <w:tab/>
-            </w:r>
-            <w:r>
-              <w:rPr>
-                <w:noProof/>
-                <w:webHidden/>
-                <w:sz w:val="28"/>
-                <w:szCs w:val="28"/>
-              </w:rPr>
-              <w:fldChar w:fldCharType="begin"/>
-            </w:r>
-            <w:r>
-              <w:rPr>
-                <w:noProof/>
-                <w:webHidden/>
-                <w:sz w:val="28"/>
-                <w:szCs w:val="28"/>
-              </w:rPr>
-              <w:instrText xml:space="preserve"> PAGEREF _Toc228121651 \h </w:instrText>
-            </w:r>
-            <w:r>
-              <w:rPr>
-                <w:noProof/>
-                <w:webHidden/>
-                <w:sz w:val="28"/>
-                <w:szCs w:val="28"/>
-              </w:rPr>
-            </w:r>
-            <w:r>
-              <w:rPr>
-                <w:noProof/>
-                <w:webHidden/>
-                <w:sz w:val="28"/>
-                <w:szCs w:val="28"/>
-              </w:rPr>
-              <w:fldChar w:fldCharType="separate"/>
-            </w:r>
-            <w:r>
-              <w:rPr>
-                <w:noProof/>
-                <w:webHidden/>
-                <w:sz w:val="28"/>
-                <w:szCs w:val="28"/>
-              </w:rPr>
-              <w:t>3</w:t>
-            </w:r>
-            <w:r>
-              <w:rPr>
-                <w:noProof/>
-                <w:webHidden/>
-                <w:sz w:val="28"/>
-                <w:szCs w:val="28"/>
-              </w:rPr>
-              <w:fldChar w:fldCharType="end"/>
-            </w:r>
-          </w:hyperlink>
-        </w:p>
-        <w:p>
-          <w:pPr>
-            <w:pStyle w:val="TOC2"/>
-            <w:tabs>
-              <w:tab w:val="right" w:leader="dot" w:pos="9350"/>
-            </w:tabs>
-            <w:jc w:val="center"/>
-            <w:rPr>
-              <w:noProof/>
-              <w:sz w:val="28"/>
-              <w:szCs w:val="28"/>
-            </w:rPr>
-          </w:pPr>
-          <w:hyperlink w:anchor="_Toc228121652" w:history="1">
-            <w:r>
-              <w:rPr>
-                <w:rStyle w:val="Hyperlink"/>
-                <w:noProof/>
-                <w:sz w:val="28"/>
-                <w:szCs w:val="28"/>
-              </w:rPr>
-              <w:t>Second Pipeline</w:t>
-            </w:r>
-            <w:r>
-              <w:rPr>
-                <w:noProof/>
-                <w:webHidden/>
-                <w:sz w:val="28"/>
-                <w:szCs w:val="28"/>
-              </w:rPr>
-              <w:tab/>
-            </w:r>
-            <w:r>
-              <w:rPr>
-                <w:noProof/>
-                <w:webHidden/>
-                <w:sz w:val="28"/>
-                <w:szCs w:val="28"/>
-              </w:rPr>
-              <w:fldChar w:fldCharType="begin"/>
-            </w:r>
-            <w:r>
-              <w:rPr>
-                <w:noProof/>
-                <w:webHidden/>
-                <w:sz w:val="28"/>
-                <w:szCs w:val="28"/>
-              </w:rPr>
-              <w:instrText xml:space="preserve"> PAGEREF _Toc228121652 \h </w:instrText>
-            </w:r>
-            <w:r>
-              <w:rPr>
-                <w:noProof/>
-                <w:webHidden/>
-                <w:sz w:val="28"/>
-                <w:szCs w:val="28"/>
-              </w:rPr>
-            </w:r>
-            <w:r>
-              <w:rPr>
-                <w:noProof/>
-                <w:webHidden/>
-                <w:sz w:val="28"/>
-                <w:szCs w:val="28"/>
-              </w:rPr>
-              <w:fldChar w:fldCharType="separate"/>
-            </w:r>
-            <w:r>
-              <w:rPr>
-                <w:noProof/>
-                <w:webHidden/>
-                <w:sz w:val="28"/>
-                <w:szCs w:val="28"/>
-              </w:rPr>
-              <w:t>4</w:t>
-            </w:r>
-            <w:r>
-              <w:rPr>
-                <w:noProof/>
-                <w:webHidden/>
-                <w:sz w:val="28"/>
-                <w:szCs w:val="28"/>
-              </w:rPr>
-              <w:fldChar w:fldCharType="end"/>
-            </w:r>
-          </w:hyperlink>
-        </w:p>
-        <w:p>
-          <w:pPr>
-            <w:pStyle w:val="TOC2"/>
-            <w:tabs>
-              <w:tab w:val="right" w:leader="dot" w:pos="9350"/>
-            </w:tabs>
-            <w:jc w:val="center"/>
-            <w:rPr>
-              <w:noProof/>
-              <w:sz w:val="28"/>
-              <w:szCs w:val="28"/>
-            </w:rPr>
-          </w:pPr>
-          <w:hyperlink w:anchor="_Toc228121653" w:history="1">
-            <w:r>
-              <w:rPr>
-                <w:rStyle w:val="Hyperlink"/>
-                <w:noProof/>
-                <w:sz w:val="28"/>
-                <w:szCs w:val="28"/>
-              </w:rPr>
-              <w:t>Evaluation</w:t>
-            </w:r>
-            <w:r>
-              <w:rPr>
-                <w:noProof/>
-                <w:webHidden/>
-                <w:sz w:val="28"/>
-                <w:szCs w:val="28"/>
-              </w:rPr>
-              <w:tab/>
-            </w:r>
-            <w:r>
-              <w:rPr>
-                <w:noProof/>
-                <w:webHidden/>
-                <w:sz w:val="28"/>
-                <w:szCs w:val="28"/>
-              </w:rPr>
-              <w:fldChar w:fldCharType="begin"/>
-            </w:r>
-            <w:r>
-              <w:rPr>
-                <w:noProof/>
-                <w:webHidden/>
-                <w:sz w:val="28"/>
-                <w:szCs w:val="28"/>
-              </w:rPr>
-              <w:instrText xml:space="preserve"> PAGEREF _Toc228121653 \h </w:instrText>
-            </w:r>
-            <w:r>
-              <w:rPr>
-                <w:noProof/>
-                <w:webHidden/>
-                <w:sz w:val="28"/>
-                <w:szCs w:val="28"/>
-              </w:rPr>
-            </w:r>
-            <w:r>
-              <w:rPr>
-                <w:noProof/>
-                <w:webHidden/>
-                <w:sz w:val="28"/>
-                <w:szCs w:val="28"/>
-              </w:rPr>
-              <w:fldChar w:fldCharType="separate"/>
-            </w:r>
-            <w:r>
-              <w:rPr>
-                <w:noProof/>
-                <w:webHidden/>
-                <w:sz w:val="28"/>
-                <w:szCs w:val="28"/>
-              </w:rPr>
-              <w:t>4</w:t>
-            </w:r>
-            <w:r>
-              <w:rPr>
-                <w:noProof/>
-                <w:webHidden/>
-                <w:sz w:val="28"/>
-                <w:szCs w:val="28"/>
-              </w:rPr>
-              <w:fldChar w:fldCharType="end"/>
-            </w:r>
-          </w:hyperlink>
-        </w:p>
-        <w:p>
-          <w:pPr>
-            <w:pStyle w:val="TOC1"/>
-            <w:tabs>
-              <w:tab w:val="right" w:leader="dot" w:pos="9350"/>
-            </w:tabs>
-            <w:jc w:val="center"/>
-            <w:rPr>
-              <w:rFonts w:eastAsiaTheme="minorEastAsia"/>
-              <w:noProof/>
-              <w:sz w:val="28"/>
-              <w:szCs w:val="28"/>
-            </w:rPr>
-          </w:pPr>
-          <w:hyperlink w:anchor="_Toc228121654" w:history="1">
-            <w:r>
-              <w:rPr>
-                <w:rStyle w:val="Hyperlink"/>
-                <w:noProof/>
-                <w:sz w:val="28"/>
-                <w:szCs w:val="28"/>
-              </w:rPr>
-              <w:t>4. Summary of Results</w:t>
-            </w:r>
-            <w:r>
-              <w:rPr>
-                <w:noProof/>
-                <w:webHidden/>
-                <w:sz w:val="28"/>
-                <w:szCs w:val="28"/>
-              </w:rPr>
-              <w:tab/>
-            </w:r>
-            <w:r>
-              <w:rPr>
-                <w:noProof/>
-                <w:webHidden/>
-                <w:sz w:val="28"/>
-                <w:szCs w:val="28"/>
-              </w:rPr>
-              <w:fldChar w:fldCharType="begin"/>
-            </w:r>
-            <w:r>
-              <w:rPr>
-                <w:noProof/>
-                <w:webHidden/>
-                <w:sz w:val="28"/>
-                <w:szCs w:val="28"/>
-              </w:rPr>
-              <w:instrText xml:space="preserve"> PAGEREF _Toc228121654 \h </w:instrText>
-            </w:r>
-            <w:r>
-              <w:rPr>
-                <w:noProof/>
-                <w:webHidden/>
-                <w:sz w:val="28"/>
-                <w:szCs w:val="28"/>
-              </w:rPr>
-            </w:r>
-            <w:r>
-              <w:rPr>
-                <w:noProof/>
-                <w:webHidden/>
-                <w:sz w:val="28"/>
-                <w:szCs w:val="28"/>
-              </w:rPr>
-              <w:fldChar w:fldCharType="separate"/>
-            </w:r>
-            <w:r>
-              <w:rPr>
-                <w:noProof/>
-                <w:webHidden/>
-                <w:sz w:val="28"/>
-                <w:szCs w:val="28"/>
-              </w:rPr>
-              <w:t>4</w:t>
-            </w:r>
-            <w:r>
-              <w:rPr>
-                <w:noProof/>
-                <w:webHidden/>
-                <w:sz w:val="28"/>
-                <w:szCs w:val="28"/>
-              </w:rPr>
-              <w:fldChar w:fldCharType="end"/>
-            </w:r>
-          </w:hyperlink>
-        </w:p>
-        <w:p>
-          <w:r>
-            <w:rPr>
-              <w:b/>
-              <w:bCs/>
-              <w:noProof/>
-              <w:sz w:val="28"/>
-              <w:szCs w:val="28"/>
-            </w:rPr>
-            <w:fldChar w:fldCharType="end"/>
-          </w:r>
-        </w:p>
-      </w:sdtContent>
-    </w:sdt>
-    <w:p>
-      <w:pPr>
-        <w:pStyle w:val="Heading1"/>
-      </w:pPr>
-    </w:p>
-    <w:p/>
-    <w:p/>
-    <w:p/>
-    <w:p/>
-    <w:p/>
-    <w:p/>
-    <w:p/>
-    <w:p/>
-    <w:p/>
-    <w:p/>
-    <w:p/>
-    <w:p/>
-    <w:p/>
-    <w:p/>
-    <w:p/>
-    <w:p>
-      <w:pPr>
-        <w:pStyle w:val="Heading1"/>
-        <w:rPr>
-          <w:color w:val="auto"/>
+          <w:u w:val="single"/>
         </w:rPr>
       </w:pPr>
       <w:bookmarkStart w:id="0" w:name="_Toc228121648"/>
       <w:r>
         <w:rPr>
-          <w:color w:val="auto"/>
+          <w:b/>
+          <w:bCs/>
+          <w:sz w:val="32"/>
+          <w:szCs w:val="32"/>
+          <w:u w:val="single"/>
         </w:rPr>
         <w:lastRenderedPageBreak/>
         <w:t>1. Data Source</w:t>
@@ -1205,14 +499,21 @@
     </w:p>
     <w:p>
       <w:pPr>
-        <w:pStyle w:val="Heading1"/>
-        <w:rPr>
-          <w:color w:val="auto"/>
-        </w:rPr>
-      </w:pPr>
-      <w:r>
-        <w:rPr>
-          <w:color w:val="auto"/>
+        <w:rPr>
+          <w:b/>
+          <w:bCs/>
+          <w:sz w:val="32"/>
+          <w:szCs w:val="32"/>
+          <w:u w:val="single"/>
+        </w:rPr>
+      </w:pPr>
+      <w:r>
+        <w:rPr>
+          <w:b/>
+          <w:bCs/>
+          <w:sz w:val="32"/>
+          <w:szCs w:val="32"/>
+          <w:u w:val="single"/>
         </w:rPr>
         <w:t>2. Approach</w:t>
       </w:r>
@@ -1225,15 +526,22 @@
     </w:p>
     <w:p>
       <w:pPr>
-        <w:pStyle w:val="Heading1"/>
-        <w:rPr>
-          <w:color w:val="auto"/>
+        <w:rPr>
+          <w:b/>
+          <w:bCs/>
+          <w:sz w:val="32"/>
+          <w:szCs w:val="32"/>
+          <w:u w:val="single"/>
         </w:rPr>
       </w:pPr>
       <w:bookmarkStart w:id="2" w:name="_Toc228121650"/>
       <w:r>
         <w:rPr>
-          <w:color w:val="auto"/>
+          <w:b/>
+          <w:bCs/>
+          <w:sz w:val="32"/>
+          <w:szCs w:val="32"/>
+          <w:u w:val="single"/>
         </w:rPr>
         <w:t>3. Summary of Methods Used</w:t>
       </w:r>
@@ -1241,14 +549,13 @@
     </w:p>
     <w:p>
       <w:pPr>
-        <w:pStyle w:val="Heading2"/>
-        <w:rPr>
-          <w:color w:val="auto"/>
-        </w:rPr>
-      </w:pPr>
-      <w:r>
-        <w:rPr>
-          <w:color w:val="auto"/>
+        <w:rPr>
+          <w:u w:val="single"/>
+        </w:rPr>
+      </w:pPr>
+      <w:r>
+        <w:rPr>
+          <w:u w:val="single"/>
         </w:rPr>
         <w:t>Dual-Pipeline Architecture (V1 &amp; V2)</w:t>
       </w:r>
@@ -1276,14 +583,13 @@
     </w:p>
     <w:p>
       <w:pPr>
-        <w:pStyle w:val="Heading2"/>
-        <w:rPr>
-          <w:color w:val="auto"/>
-        </w:rPr>
-      </w:pPr>
-      <w:r>
-        <w:rPr>
-          <w:color w:val="auto"/>
+        <w:rPr>
+          <w:u w:val="single"/>
+        </w:rPr>
+      </w:pPr>
+      <w:r>
+        <w:rPr>
+          <w:u w:val="single"/>
         </w:rPr>
         <w:t>Time-Invariant Scaling</w:t>
       </w:r>
@@ -1295,21 +601,20 @@
     </w:p>
     <w:p>
       <w:pPr>
-        <w:pStyle w:val="Heading2"/>
-        <w:rPr>
-          <w:color w:val="auto"/>
-        </w:rPr>
-      </w:pPr>
-      <w:r>
-        <w:rPr>
-          <w:color w:val="auto"/>
-        </w:rPr>
+        <w:rPr>
+          <w:u w:val="single"/>
+        </w:rPr>
+      </w:pPr>
+      <w:r>
+        <w:rPr>
+          <w:u w:val="single"/>
+        </w:rPr>
+        <w:t>Domain Oversampling</w:t>
+      </w:r>
+    </w:p>
+    <w:p>
+      <w:r>
         <w:lastRenderedPageBreak/>
-        <w:t>Domain Oversampling</w:t>
-      </w:r>
-    </w:p>
-    <w:p>
-      <w:r>
         <w:t xml:space="preserve">Our dataset suffers from severe imbalance (~990 "source" vs. ~10 "target" factory recordings). To stop the model from overfitting and tanking our partial AUC scores, we oversample the target files and apply random circular time-shifts. This forces the model to learn features that </w:t>
       </w:r>
       <w:proofErr w:type="gramStart"/>
@@ -1323,14 +628,13 @@
     </w:p>
     <w:p>
       <w:pPr>
-        <w:pStyle w:val="Heading2"/>
-        <w:rPr>
-          <w:color w:val="auto"/>
-        </w:rPr>
-      </w:pPr>
-      <w:r>
-        <w:rPr>
-          <w:color w:val="auto"/>
+        <w:rPr>
+          <w:u w:val="single"/>
+        </w:rPr>
+      </w:pPr>
+      <w:r>
+        <w:rPr>
+          <w:u w:val="single"/>
         </w:rPr>
         <w:t>Reconstruction Error Scoring</w:t>
       </w:r>
@@ -1342,15 +646,22 @@
     </w:p>
     <w:p>
       <w:pPr>
-        <w:pStyle w:val="Heading1"/>
-        <w:rPr>
-          <w:color w:val="auto"/>
+        <w:rPr>
+          <w:b/>
+          <w:bCs/>
+          <w:sz w:val="32"/>
+          <w:szCs w:val="32"/>
+          <w:u w:val="single"/>
         </w:rPr>
       </w:pPr>
       <w:bookmarkStart w:id="3" w:name="_Toc228121654"/>
       <w:r>
         <w:rPr>
-          <w:color w:val="auto"/>
+          <w:b/>
+          <w:bCs/>
+          <w:sz w:val="32"/>
+          <w:szCs w:val="32"/>
+          <w:u w:val="single"/>
         </w:rPr>
         <w:t>4. Summary of Results</w:t>
       </w:r>
@@ -3394,6 +2705,7 @@
   <w:style w:type="character" w:default="1" w:styleId="DefaultParagraphFont">
     <w:name w:val="Default Paragraph Font"/>
     <w:uiPriority w:val="1"/>
+    <w:semiHidden/>
     <w:unhideWhenUsed/>
   </w:style>
   <w:style w:type="table" w:default="1" w:styleId="TableNormal">

</xml_diff>